<commit_message>
Second deepening pass: 12 sales and manager pages, downloads point onward
</commit_message>
<xml_diff>
--- a/downloads/freelance-how-to-check-an-invoice-is-correct.docx
+++ b/downloads/freelance-how-to-check-an-invoice-is-correct.docx
@@ -729,7 +729,19 @@
           <w:color w:val="666666"/>
           <w:sz w:val="18"/>
         </w:rPr>
-        <w:t xml:space="preserve">https://proskillpacks.github.io/freelance/how-to-check-an-invoice-is-correct/   More free pages like this: https://proskillpacks.github.io/guides/</w:t>
+        <w:t xml:space="preserve">https://proskillpacks.github.io/freelance/how-to-check-an-invoice-is-correct/</w:t>
+      </w:r>
+    </w:p>
+    <w:p>
+      <w:pPr>
+        <w:spacing w:after="120"/>
+      </w:pPr>
+      <w:r>
+        <w:rPr>
+          <w:color w:val="666666"/>
+          <w:sz w:val="18"/>
+        </w:rPr>
+        <w:t xml:space="preserve">More free pages: https://proskillpacks.github.io/freelance/</w:t>
       </w:r>
     </w:p>
     <w:sectPr>

</xml_diff>